<commit_message>
feat: finalize smart corporate student enquiry form with corrected typography and full-width attended-by line
</commit_message>
<xml_diff>
--- a/Finesse-Student-Enquiry-Form.docx
+++ b/Finesse-Student-Enquiry-Form.docx
@@ -137,7 +137,7 @@
     </w:tbl>
     <w:p>
       <w:pPr>
-        <w:spacing w:before="40" w:after="160"/>
+        <w:spacing w:before="40" w:after="280"/>
         <w:pBdr>
           <w:bottom w:val="single" w:sz="14" w:space="1" w:color="0F766E"/>
         </w:pBdr>
@@ -237,7 +237,7 @@
           <w:color w:val="0F172A"/>
           <w:sz w:val="21"/>
         </w:rPr>
-        <w:t xml:space="preserve">Father's Mob. No.: </w:t>
+        <w:t xml:space="preserve">Father's Mobile No.: </w:t>
       </w:r>
       <w:r>
         <w:rPr>
@@ -245,7 +245,7 @@
           <w:color w:val="94A3B8"/>
           <w:sz w:val="21"/>
         </w:rPr>
-        <w:t xml:space="preserve">........................    </w:t>
+        <w:t xml:space="preserve">......................    </w:t>
       </w:r>
       <w:r>
         <w:rPr>
@@ -254,7 +254,7 @@
           <w:color w:val="0F172A"/>
           <w:sz w:val="21"/>
         </w:rPr>
-        <w:t xml:space="preserve">Mother's Mob No.: </w:t>
+        <w:t xml:space="preserve">Mother's Mobile No.: </w:t>
       </w:r>
       <w:r>
         <w:rPr>
@@ -262,7 +262,7 @@
           <w:color w:val="94A3B8"/>
           <w:sz w:val="21"/>
         </w:rPr>
-        <w:t>.........................</w:t>
+        <w:t>......................</w:t>
       </w:r>
     </w:p>
     <w:p>
@@ -298,7 +298,7 @@
           <w:color w:val="0F172A"/>
           <w:sz w:val="21"/>
         </w:rPr>
-        <w:t xml:space="preserve">Qualification: </w:t>
+        <w:t xml:space="preserve">Highest Qualification: </w:t>
       </w:r>
       <w:r>
         <w:rPr>
@@ -306,7 +306,7 @@
           <w:color w:val="94A3B8"/>
           <w:sz w:val="21"/>
         </w:rPr>
-        <w:t>..............................................................................</w:t>
+        <w:t>......................................................................</w:t>
       </w:r>
     </w:p>
     <w:p>
@@ -320,7 +320,7 @@
           <w:color w:val="0F172A"/>
           <w:sz w:val="21"/>
         </w:rPr>
-        <w:t xml:space="preserve">Interested in Bachelor/ Master in: </w:t>
+        <w:t xml:space="preserve">Interested in (Bachelor's / Master's): </w:t>
       </w:r>
       <w:r>
         <w:rPr>
@@ -328,7 +328,7 @@
           <w:color w:val="94A3B8"/>
           <w:sz w:val="21"/>
         </w:rPr>
-        <w:t>..........................................................</w:t>
+        <w:t>......................................................</w:t>
       </w:r>
     </w:p>
     <w:p>
@@ -364,7 +364,7 @@
           <w:color w:val="0F172A"/>
           <w:sz w:val="21"/>
         </w:rPr>
-        <w:t xml:space="preserve">Intake: </w:t>
+        <w:t xml:space="preserve">Target Intake: </w:t>
       </w:r>
       <w:r>
         <w:rPr>
@@ -372,7 +372,7 @@
           <w:color w:val="94A3B8"/>
           <w:sz w:val="21"/>
         </w:rPr>
-        <w:t>.....................................................................................</w:t>
+        <w:t>..............................................................................</w:t>
       </w:r>
     </w:p>
     <w:p>
@@ -386,7 +386,7 @@
           <w:color w:val="0F172A"/>
           <w:sz w:val="21"/>
         </w:rPr>
-        <w:t xml:space="preserve">Country Interested: </w:t>
+        <w:t xml:space="preserve">Country of Interest: </w:t>
       </w:r>
       <w:r>
         <w:rPr>
@@ -394,7 +394,7 @@
           <w:color w:val="94A3B8"/>
           <w:sz w:val="21"/>
         </w:rPr>
-        <w:t>.........................................................................</w:t>
+        <w:t>........................................................................</w:t>
       </w:r>
     </w:p>
     <w:p>
@@ -430,7 +430,7 @@
           <w:color w:val="0F172A"/>
           <w:sz w:val="21"/>
         </w:rPr>
-        <w:t xml:space="preserve">Finance- self / Educational Loan: </w:t>
+        <w:t xml:space="preserve">Finance: Self / Education Loan: </w:t>
       </w:r>
       <w:r>
         <w:rPr>
@@ -438,7 +438,7 @@
           <w:color w:val="94A3B8"/>
           <w:sz w:val="21"/>
         </w:rPr>
-        <w:t>...........................................................</w:t>
+        <w:t>.............................................................</w:t>
       </w:r>
     </w:p>
     <w:p>
@@ -452,7 +452,7 @@
           <w:color w:val="0F172A"/>
           <w:sz w:val="21"/>
         </w:rPr>
-        <w:t xml:space="preserve">How do you know about us: </w:t>
+        <w:t xml:space="preserve">How do you know about us?: </w:t>
       </w:r>
       <w:r>
         <w:rPr>
@@ -460,7 +460,7 @@
           <w:color w:val="94A3B8"/>
           <w:sz w:val="21"/>
         </w:rPr>
-        <w:t>...................................................................</w:t>
+        <w:t>..................................................................</w:t>
       </w:r>
     </w:p>
     <w:tbl>
@@ -503,7 +503,7 @@
                 <w:color w:val="0F766E"/>
                 <w:sz w:val="19"/>
               </w:rPr>
-              <w:t>FOR OFFICE USE</w:t>
+              <w:t>FOR OFFICE USE ONLY</w:t>
             </w:r>
             <w:r>
               <w:rPr>
@@ -511,7 +511,7 @@
                 <w:color w:val="475569"/>
                 <w:sz w:val="16"/>
               </w:rPr>
-              <w:t xml:space="preserve">                                                                                  Counseling Record</w:t>
+              <w:t xml:space="preserve">                                                                             Counseling Record</w:t>
             </w:r>
           </w:p>
         </w:tc>
@@ -535,19 +535,7 @@
               <w:t xml:space="preserve">Attended by: </w:t>
             </w:r>
             <w:r>
-              <w:t xml:space="preserve">....................................................................    </w:t>
-            </w:r>
-            <w:r>
-              <w:rPr>
-                <w:rFonts w:ascii="Calibri" w:hAnsi="Calibri"/>
-                <w:b/>
-                <w:color w:val="0F766E"/>
-                <w:sz w:val="19"/>
-              </w:rPr>
-              <w:t xml:space="preserve">Signature: </w:t>
-            </w:r>
-            <w:r>
-              <w:t>........................................</w:t>
+              <w:t>................................................................................................................................................</w:t>
             </w:r>
           </w:p>
         </w:tc>

</xml_diff>